<commit_message>
Prune filler images from both slide decks; keep only the ones that help
Audited every image placeholder: an image stays only if it makes a
visual or abstract point clearer, not to fill a quota.
- Ayşegül: drop the decorative agenda "map" (Slide 4) — the list is the
  visual; every other image is a real UI screenshot and stays.
- Arciel (backend, less visual): drop the redundant 3rd pipeline diagram
  (Slide 3) and the agenda map (Slide 4); replace the "4 chips" filler
  (Slide 15) with the real Pipeline cockpit screenshot and the 3-icon
  montage (Slide 16) with a real pytest test-name snippet; trim Slide 14
  so the real Pipeline shot isn't duplicated. Genuinely-clarifying
  diagrams (cascade funnel, confidence gate, PoW ladder, schema layers,
  feedback loop) kept.
Removed-image slides carry a short note explaining why, so it reads as a
choice, not an oversight.

Co-Authored-By: Claude Opus 4.8 <noreply@anthropic.com>
</commit_message>
<xml_diff>
--- a/docs/defense/docx/Arciel_Baez_Zamora_Slides_EN.docx
+++ b/docs/defense/docx/Arciel_Baez_Zamora_Slides_EN.docx
@@ -786,79 +786,79 @@
     </w:p>
     <w:p>
       <w:pPr>
-        <w:pStyle w:val="BlockText"/>
-      </w:pPr>
-      <w:r>
-        <w:t xml:space="preserve">🖼️</w:t>
-      </w:r>
-      <w:r>
-        <w:t xml:space="preserve"> </w:t>
-      </w:r>
-      <w:r>
-        <w:rPr>
-          <w:b/>
-        </w:rPr>
-        <w:t xml:space="preserve">IMAGE:</w:t>
-      </w:r>
-      <w:r>
-        <w:t xml:space="preserve"> </w:t>
-      </w:r>
-      <w:r>
-        <w:t xml:space="preserve">the same pipeline as Slide 0, but the</w:t>
-      </w:r>
-      <w:r>
-        <w:t xml:space="preserve"> </w:t>
-      </w:r>
-      <w:r>
-        <w:rPr>
-          <w:b/>
-        </w:rPr>
-        <w:t xml:space="preserve">human box is small at the end</w:t>
-      </w:r>
-      <w:r>
-        <w:t xml:space="preserve"> </w:t>
-      </w:r>
-      <w:r>
-        <w:t xml:space="preserve">and everything feeding it is labelled</w:t>
-      </w:r>
-      <w:r>
-        <w:t xml:space="preserve"> </w:t>
-      </w:r>
-      <w:r>
+        <w:pStyle w:val="FirstParagraph"/>
+      </w:pPr>
+      <w:r>
+        <w:rPr>
+          <w:i/>
+        </w:rPr>
+        <w:t xml:space="preserve">(No image — this is the</w:t>
+      </w:r>
+      <w:r>
+        <w:rPr>
+          <w:i/>
+        </w:rPr>
+        <w:t xml:space="preserve"> </w:t>
+      </w:r>
+      <w:r>
+        <w:rPr>
+          <w:i/>
+        </w:rPr>
         <w:t xml:space="preserve">“</w:t>
       </w:r>
       <w:r>
-        <w:t xml:space="preserve">mine.</w:t>
-      </w:r>
-      <w:r>
+        <w:rPr>
+          <w:i/>
+        </w:rPr>
+        <w:t xml:space="preserve">why it’s necessary</w:t>
+      </w:r>
+      <w:r>
+        <w:rPr>
+          <w:i/>
+        </w:rPr>
         <w:t xml:space="preserve">”</w:t>
       </w:r>
       <w:r>
-        <w:t xml:space="preserve"> </w:t>
-      </w:r>
-      <w:r>
-        <w:t xml:space="preserve">Add four small risk icons over the backend: 🔓 a leaked RLS policy · 🛑 a stalled worker · 💸 wasted model quota · ❌ a wrong auto-accept.</w:t>
-      </w:r>
-      <w:r>
-        <w:t xml:space="preserve"> </w:t>
-      </w:r>
-      <w:r>
         <w:rPr>
           <w:i/>
         </w:rPr>
-        <w:t xml:space="preserve">Caption:</w:t>
-      </w:r>
-      <w:r>
-        <w:t xml:space="preserve"> </w:t>
-      </w:r>
-      <w:r>
+        <w:t xml:space="preserve"> </w:t>
+      </w:r>
+      <w:r>
+        <w:rPr>
+          <w:i/>
+        </w:rPr>
+        <w:t xml:space="preserve">argument; it lands better as clean text than as a third pipeline diagram in a row. Optional footer line:</w:t>
+      </w:r>
+      <w:r>
+        <w:rPr>
+          <w:i/>
+        </w:rPr>
+        <w:t xml:space="preserve"> </w:t>
+      </w:r>
+      <w:r>
+        <w:rPr>
+          <w:i/>
+        </w:rPr>
         <w:t xml:space="preserve">“</w:t>
       </w:r>
       <w:r>
+        <w:rPr>
+          <w:i/>
+        </w:rPr>
         <w:t xml:space="preserve">The frontend can only ever be as good as what reaches it. The backend is what reaches it.</w:t>
       </w:r>
       <w:r>
+        <w:rPr>
+          <w:i/>
+        </w:rPr>
         <w:t xml:space="preserve">”</w:t>
+      </w:r>
+      <w:r>
+        <w:rPr>
+          <w:i/>
+        </w:rPr>
+        <w:t xml:space="preserve">)</w:t>
       </w:r>
     </w:p>
     <w:p>
@@ -1063,82 +1063,43 @@
     </w:p>
     <w:p>
       <w:pPr>
-        <w:pStyle w:val="BlockText"/>
-      </w:pPr>
-      <w:r>
-        <w:t xml:space="preserve">🖼️</w:t>
-      </w:r>
-      <w:r>
-        <w:t xml:space="preserve"> </w:t>
-      </w:r>
-      <w:r>
-        <w:rPr>
-          <w:b/>
-        </w:rPr>
-        <w:t xml:space="preserve">IMAGE —</w:t>
-      </w:r>
-      <w:r>
-        <w:rPr>
-          <w:b/>
-        </w:rPr>
-        <w:t xml:space="preserve"> </w:t>
-      </w:r>
-      <w:r>
-        <w:rPr>
-          <w:b/>
+        <w:pStyle w:val="FirstParagraph"/>
+      </w:pPr>
+      <w:r>
+        <w:rPr>
+          <w:i/>
+        </w:rPr>
+        <w:t xml:space="preserve">(No image — agenda slide; the numbered list is the visual. Optional footer line:</w:t>
+      </w:r>
+      <w:r>
+        <w:rPr>
+          <w:i/>
+        </w:rPr>
+        <w:t xml:space="preserve"> </w:t>
+      </w:r>
+      <w:r>
+        <w:rPr>
+          <w:i/>
         </w:rPr>
         <w:t xml:space="preserve">“</w:t>
       </w:r>
       <w:r>
         <w:rPr>
-          <w:b/>
-        </w:rPr>
-        <w:t xml:space="preserve">map</w:t>
-      </w:r>
-      <w:r>
-        <w:rPr>
-          <w:b/>
+          <w:i/>
+        </w:rPr>
+        <w:t xml:space="preserve">A self-running research pipeline, on the Supabase and GitHub free tiers.</w:t>
+      </w:r>
+      <w:r>
+        <w:rPr>
+          <w:i/>
         </w:rPr>
         <w:t xml:space="preserve">”</w:t>
       </w:r>
       <w:r>
         <w:rPr>
-          <w:b/>
-        </w:rPr>
-        <w:t xml:space="preserve"> </w:t>
-      </w:r>
-      <w:r>
-        <w:rPr>
-          <w:b/>
-        </w:rPr>
-        <w:t xml:space="preserve">slide:</w:t>
-      </w:r>
-      <w:r>
-        <w:t xml:space="preserve"> </w:t>
-      </w:r>
-      <w:r>
-        <w:t xml:space="preserve">seven numbered tiles arranged along the pipeline flow (front door → … → runs-itself). Doubles as the agenda.</w:t>
-      </w:r>
-      <w:r>
-        <w:t xml:space="preserve"> </w:t>
-      </w:r>
-      <w:r>
-        <w:rPr>
           <w:i/>
         </w:rPr>
-        <w:t xml:space="preserve">Caption:</w:t>
-      </w:r>
-      <w:r>
-        <w:t xml:space="preserve"> </w:t>
-      </w:r>
-      <w:r>
-        <w:t xml:space="preserve">“</w:t>
-      </w:r>
-      <w:r>
-        <w:t xml:space="preserve">A self-running research pipeline, on the Supabase and GitHub free tiers.</w:t>
-      </w:r>
-      <w:r>
-        <w:t xml:space="preserve">”</w:t>
+        <w:t xml:space="preserve">)</w:t>
       </w:r>
     </w:p>
     <w:p>
@@ -3922,46 +3883,7 @@
         <w:t xml:space="preserve"> </w:t>
       </w:r>
       <w:r>
-        <w:t xml:space="preserve">box. Real inset: a GitHub Actions run list, or the</w:t>
-      </w:r>
-      <w:r>
-        <w:t xml:space="preserve"> </w:t>
-      </w:r>
-      <w:r>
-        <w:rPr>
-          <w:b/>
-        </w:rPr>
-        <w:t xml:space="preserve">Pipeline →</w:t>
-      </w:r>
-      <w:r>
-        <w:rPr>
-          <w:b/>
-        </w:rPr>
-        <w:t xml:space="preserve"> </w:t>
-      </w:r>
-      <w:r>
-        <w:rPr>
-          <w:b/>
-        </w:rPr>
-        <w:t xml:space="preserve">“</w:t>
-      </w:r>
-      <w:r>
-        <w:rPr>
-          <w:b/>
-        </w:rPr>
-        <w:t xml:space="preserve">Right Now</w:t>
-      </w:r>
-      <w:r>
-        <w:rPr>
-          <w:b/>
-        </w:rPr>
-        <w:t xml:space="preserve">”</w:t>
-      </w:r>
-      <w:r>
-        <w:t xml:space="preserve"> </w:t>
-      </w:r>
-      <w:r>
-        <w:t xml:space="preserve">cockpit grid.</w:t>
+        <w:t xml:space="preserve">box. (The real Pipeline cockpit screenshot is on the next slide — keep this one a clean diagram.)</w:t>
       </w:r>
       <w:r>
         <w:t xml:space="preserve"> </w:t>
@@ -4169,88 +4091,82 @@
         <w:rPr>
           <w:b/>
         </w:rPr>
-        <w:t xml:space="preserve">IMAGE — constraints panel:</w:t>
-      </w:r>
-      <w:r>
-        <w:t xml:space="preserve"> </w:t>
-      </w:r>
-      <w:r>
-        <w:t xml:space="preserve">four labelled chips —</w:t>
-      </w:r>
-      <w:r>
-        <w:t xml:space="preserve"> </w:t>
-      </w:r>
-      <w:r>
-        <w:rPr>
-          <w:b/>
-        </w:rPr>
-        <w:t xml:space="preserve">Quota-day across 2 timezones</w:t>
-      </w:r>
-      <w:r>
-        <w:t xml:space="preserve"> </w:t>
-      </w:r>
-      <w:r>
-        <w:t xml:space="preserve">(Gemma=UTC, Gemini=America/Los_Angeles) ·</w:t>
-      </w:r>
-      <w:r>
-        <w:t xml:space="preserve"> </w:t>
-      </w:r>
-      <w:r>
-        <w:rPr>
-          <w:b/>
-        </w:rPr>
-        <w:t xml:space="preserve">3 nested wall-clock budgets</w:t>
-      </w:r>
-      <w:r>
-        <w:t xml:space="preserve"> </w:t>
-      </w:r>
-      <w:r>
-        <w:t xml:space="preserve">(controller 75 min / crawler 2,400 s / model 300 s) ·</w:t>
-      </w:r>
-      <w:r>
-        <w:t xml:space="preserve"> </w:t>
-      </w:r>
-      <w:r>
-        <w:rPr>
-          <w:b/>
-        </w:rPr>
-        <w:t xml:space="preserve">source-URL PDFs</w:t>
-      </w:r>
-      <w:r>
-        <w:t xml:space="preserve"> </w:t>
-      </w:r>
-      <w:r>
-        <w:t xml:space="preserve">(no Supabase storage) ·</w:t>
-      </w:r>
-      <w:r>
-        <w:t xml:space="preserve"> </w:t>
-      </w:r>
-      <w:r>
-        <w:rPr>
-          <w:b/>
-        </w:rPr>
-        <w:t xml:space="preserve">same-origin PDF proxy</w:t>
-      </w:r>
-      <w:r>
-        <w:t xml:space="preserve"> </w:t>
-      </w:r>
-      <w:r>
-        <w:t xml:space="preserve">(SSRF-hardened). Optionally the</w:t>
-      </w:r>
-      <w:r>
-        <w:t xml:space="preserve"> </w:t>
-      </w:r>
-      <w:r>
-        <w:rPr>
-          <w:b/>
-        </w:rPr>
-        <w:t xml:space="preserve">Pipeline funnel</w:t>
-      </w:r>
-      <w:r>
-        <w:t xml:space="preserve"> </w:t>
-      </w:r>
-      <w:r>
-        <w:t xml:space="preserve">screenshot.</w:t>
+        <w:t xml:space="preserve">IMAGE — real cockpit screenshot:</w:t>
+      </w:r>
+      <w:r>
+        <w:t xml:space="preserve"> </w:t>
+      </w:r>
+      <w:r>
+        <w:t xml:space="preserve">the</w:t>
+      </w:r>
+      <w:r>
+        <w:t xml:space="preserve"> </w:t>
+      </w:r>
+      <w:r>
+        <w:rPr>
+          <w:b/>
+        </w:rPr>
+        <w:t xml:space="preserve">Pipeline</w:t>
+      </w:r>
+      <w:r>
+        <w:t xml:space="preserve"> </w:t>
+      </w:r>
+      <w:r>
+        <w:t xml:space="preserve">view you built — the</w:t>
+      </w:r>
+      <w:r>
+        <w:t xml:space="preserve"> </w:t>
+      </w:r>
+      <w:r>
+        <w:rPr>
+          <w:b/>
+        </w:rPr>
+        <w:t xml:space="preserve">“</w:t>
+      </w:r>
+      <w:r>
+        <w:rPr>
+          <w:b/>
+        </w:rPr>
+        <w:t xml:space="preserve">Paper Funnel</w:t>
+      </w:r>
+      <w:r>
+        <w:rPr>
+          <w:b/>
+        </w:rPr>
+        <w:t xml:space="preserve">”</w:t>
+      </w:r>
+      <w:r>
+        <w:t xml:space="preserve"> </w:t>
+      </w:r>
+      <w:r>
+        <w:t xml:space="preserve">bars (search → filter → upload → small / medium / strong → human, with kept/dropped counts) and the live</w:t>
+      </w:r>
+      <w:r>
+        <w:t xml:space="preserve"> </w:t>
+      </w:r>
+      <w:r>
+        <w:rPr>
+          <w:b/>
+        </w:rPr>
+        <w:t xml:space="preserve">“</w:t>
+      </w:r>
+      <w:r>
+        <w:rPr>
+          <w:b/>
+        </w:rPr>
+        <w:t xml:space="preserve">Right Now</w:t>
+      </w:r>
+      <w:r>
+        <w:rPr>
+          <w:b/>
+        </w:rPr>
+        <w:t xml:space="preserve">”</w:t>
+      </w:r>
+      <w:r>
+        <w:t xml:space="preserve"> </w:t>
+      </w:r>
+      <w:r>
+        <w:t xml:space="preserve">grid. This is the genuine operational artifact; the four constraints below are the talking points over it.</w:t>
       </w:r>
       <w:r>
         <w:t xml:space="preserve"> </w:t>
@@ -4459,30 +4375,45 @@
         <w:rPr>
           <w:b/>
         </w:rPr>
-        <w:t xml:space="preserve">IMAGE — three-panel:</w:t>
-      </w:r>
-      <w:r>
-        <w:t xml:space="preserve"> </w:t>
-      </w:r>
-      <w:r>
-        <w:t xml:space="preserve">(1)</w:t>
-      </w:r>
-      <w:r>
-        <w:t xml:space="preserve"> </w:t>
-      </w:r>
-      <w:r>
-        <w:rPr>
-          <w:b/>
-        </w:rPr>
-        <w:t xml:space="preserve">USDA CSV → idempotent upsert → canonical foods/nutrients</w:t>
-      </w:r>
-      <w:r>
-        <w:t xml:space="preserve">; (2) a list of real test names reading like a spec (</w:t>
+        <w:t xml:space="preserve">IMAGE — a real test-file snippet:</w:t>
+      </w:r>
+      <w:r>
+        <w:t xml:space="preserve"> </w:t>
+      </w:r>
+      <w:r>
+        <w:t xml:space="preserve">a screenshot of actual</w:t>
+      </w:r>
+      <w:r>
+        <w:t xml:space="preserve"> </w:t>
       </w:r>
       <w:r>
         <w:rPr>
           <w:rStyle w:val="VerbatimChar"/>
         </w:rPr>
+        <w:t xml:space="preserve">pytest</w:t>
+      </w:r>
+      <w:r>
+        <w:t xml:space="preserve"> </w:t>
+      </w:r>
+      <w:r>
+        <w:t xml:space="preserve">function names from</w:t>
+      </w:r>
+      <w:r>
+        <w:t xml:space="preserve"> </w:t>
+      </w:r>
+      <w:r>
+        <w:rPr>
+          <w:rStyle w:val="VerbatimChar"/>
+        </w:rPr>
+        <w:t xml:space="preserve">test_ai_routing.py</w:t>
+      </w:r>
+      <w:r>
+        <w:t xml:space="preserve">, which read like a specification of the invariants — e.g. </w:t>
+      </w:r>
+      <w:r>
+        <w:rPr>
+          <w:rStyle w:val="VerbatimChar"/>
+        </w:rPr>
         <w:t xml:space="preserve">rejects_stale_or_mismatched_db_ids</w:t>
       </w:r>
       <w:r>
@@ -4507,10 +4438,22 @@
         <w:rPr>
           <w:rStyle w:val="VerbatimChar"/>
         </w:rPr>
+        <w:t xml:space="preserve">audit_sampling_is_deterministic</w:t>
+      </w:r>
+      <w:r>
+        <w:t xml:space="preserve">,</w:t>
+      </w:r>
+      <w:r>
+        <w:t xml:space="preserve"> </w:t>
+      </w:r>
+      <w:r>
+        <w:rPr>
+          <w:rStyle w:val="VerbatimChar"/>
+        </w:rPr>
         <w:t xml:space="preserve">build_labels_excludes_ai_model_outcomes</w:t>
       </w:r>
       <w:r>
-        <w:t xml:space="preserve">); (3) a docs stack (README · AGENTS · STATE · workflow map).</w:t>
+        <w:t xml:space="preserve">. (One concrete panel beats a three-icon montage here.)</w:t>
       </w:r>
       <w:r>
         <w:t xml:space="preserve"> </w:t>

</xml_diff>